<commit_message>
docs: embed visual diagrams into Bekat technical architecture DOCX and PDF
</commit_message>
<xml_diff>
--- a/docs/Bekat_Texnik_Sxema_va_Arxitektura.docx
+++ b/docs/Bekat_Texnik_Sxema_va_Arxitektura.docx
@@ -128,7 +128,7 @@
     </w:p>
     <w:p>
       <w:pPr>
-        <w:spacing w:before="280" w:after="80"/>
+        <w:spacing w:before="280" w:after="120"/>
       </w:pPr>
       <w:r>
         <w:rPr>
@@ -715,7 +715,7 @@
     </w:p>
     <w:p>
       <w:pPr>
-        <w:spacing w:before="280" w:after="80"/>
+        <w:spacing w:before="280" w:after="120"/>
       </w:pPr>
       <w:r>
         <w:rPr>
@@ -788,7 +788,7 @@
     </w:p>
     <w:p>
       <w:pPr>
-        <w:spacing w:before="280" w:after="80"/>
+        <w:spacing w:before="280" w:after="120"/>
       </w:pPr>
       <w:r>
         <w:rPr>
@@ -801,6 +801,46 @@
     </w:p>
     <w:p>
       <w:pPr>
+        <w:spacing w:after="200"/>
+        <w:jc w:val="center"/>
+      </w:pPr>
+      <w:r>
+        <w:drawing>
+          <wp:inline xmlns:a="http://schemas.openxmlformats.org/drawingml/2006/main" xmlns:pic="http://schemas.openxmlformats.org/drawingml/2006/picture">
+            <wp:extent cx="5852160" cy="3950208"/>
+            <wp:docPr id="1" name="Picture 1"/>
+            <wp:cNvGraphicFramePr>
+              <a:graphicFrameLocks noChangeAspect="1"/>
+            </wp:cNvGraphicFramePr>
+            <a:graphic>
+              <a:graphicData uri="http://schemas.openxmlformats.org/drawingml/2006/picture">
+                <pic:pic>
+                  <pic:nvPicPr>
+                    <pic:cNvPr id="0" name="bekat_architecture_diagram.png"/>
+                    <pic:cNvPicPr/>
+                  </pic:nvPicPr>
+                  <pic:blipFill>
+                    <a:blip r:embed="rId9"/>
+                    <a:stretch>
+                      <a:fillRect/>
+                    </a:stretch>
+                  </pic:blipFill>
+                  <pic:spPr>
+                    <a:xfrm>
+                      <a:off x="0" y="0"/>
+                      <a:ext cx="5852160" cy="3950208"/>
+                    </a:xfrm>
+                    <a:prstGeom prst="rect"/>
+                  </pic:spPr>
+                </pic:pic>
+              </a:graphicData>
+            </a:graphic>
+          </wp:inline>
+        </w:drawing>
+      </w:r>
+    </w:p>
+    <w:p>
+      <w:pPr>
         <w:spacing w:after="80"/>
       </w:pPr>
       <w:r>
@@ -809,282 +849,6 @@
           <w:sz w:val="20"/>
         </w:rPr>
         <w:t>Архитектура системы разделена на 4 независимых технологических слоя:</w:t>
-      </w:r>
-    </w:p>
-    <w:p>
-      <w:pPr>
-        <w:spacing w:after="20"/>
-      </w:pPr>
-      <w:r>
-        <w:rPr>
-          <w:rFonts w:ascii="Courier New" w:hAnsi="Courier New"/>
-          <w:sz w:val="16"/>
-        </w:rPr>
-        <w:t>┌─────────────────────────────────────────────────────────────────────────┐</w:t>
-      </w:r>
-    </w:p>
-    <w:p>
-      <w:pPr>
-        <w:spacing w:after="20"/>
-      </w:pPr>
-      <w:r>
-        <w:rPr>
-          <w:rFonts w:ascii="Courier New" w:hAnsi="Courier New"/>
-          <w:sz w:val="16"/>
-        </w:rPr>
-        <w:t>│ 1. КЛИЕНТСКИЙ ИНТЕРФЕЙС (Flutter Presentation Layer — Android/iOS/Web)  │</w:t>
-      </w:r>
-    </w:p>
-    <w:p>
-      <w:pPr>
-        <w:spacing w:after="20"/>
-      </w:pPr>
-      <w:r>
-        <w:rPr>
-          <w:rFonts w:ascii="Courier New" w:hAnsi="Courier New"/>
-          <w:sz w:val="16"/>
-        </w:rPr>
-        <w:t>│  HomeScreen (3D карта) │ SchemeScreen (Схема метро) │ SearchScreen      │</w:t>
-      </w:r>
-    </w:p>
-    <w:p>
-      <w:pPr>
-        <w:spacing w:after="20"/>
-      </w:pPr>
-      <w:r>
-        <w:rPr>
-          <w:rFonts w:ascii="Courier New" w:hAnsi="Courier New"/>
-          <w:sz w:val="16"/>
-        </w:rPr>
-        <w:t>│  TripProgress (В пути) │ SettingsSheet (Языки, Демо-часы, Крупный текст)│</w:t>
-      </w:r>
-    </w:p>
-    <w:p>
-      <w:pPr>
-        <w:spacing w:after="20"/>
-      </w:pPr>
-      <w:r>
-        <w:rPr>
-          <w:rFonts w:ascii="Courier New" w:hAnsi="Courier New"/>
-          <w:sz w:val="16"/>
-        </w:rPr>
-        <w:t>└────────────────────────────────────┬────────────────────────────────────┘</w:t>
-      </w:r>
-    </w:p>
-    <w:p>
-      <w:pPr>
-        <w:spacing w:after="20"/>
-      </w:pPr>
-      <w:r>
-        <w:rPr>
-          <w:rFonts w:ascii="Courier New" w:hAnsi="Courier New"/>
-          <w:sz w:val="16"/>
-        </w:rPr>
-        <w:t>│ ChangeNotifier / Reactive State</w:t>
-      </w:r>
-    </w:p>
-    <w:p>
-      <w:pPr>
-        <w:spacing w:after="20"/>
-      </w:pPr>
-      <w:r>
-        <w:rPr>
-          <w:rFonts w:ascii="Courier New" w:hAnsi="Courier New"/>
-          <w:sz w:val="16"/>
-        </w:rPr>
-        <w:t>┌────────────────────────────────────▼────────────────────────────────────┐</w:t>
-      </w:r>
-    </w:p>
-    <w:p>
-      <w:pPr>
-        <w:spacing w:after="20"/>
-      </w:pPr>
-      <w:r>
-        <w:rPr>
-          <w:rFonts w:ascii="Courier New" w:hAnsi="Courier New"/>
-          <w:sz w:val="16"/>
-        </w:rPr>
-        <w:t>│ 2. УМНОЕ МАТЕМАТИЧЕСКОЕ ЯДРО (Domain &amp; Routing Engine — Чистый Dart)    │</w:t>
-      </w:r>
-    </w:p>
-    <w:p>
-      <w:pPr>
-        <w:spacing w:after="20"/>
-      </w:pPr>
-      <w:r>
-        <w:rPr>
-          <w:rFonts w:ascii="Courier New" w:hAnsi="Courier New"/>
-          <w:sz w:val="16"/>
-        </w:rPr>
-        <w:t>│  RaptorPlanner (RAPTOR алгоритм) │ Schedule (Расписания и интервалы)    │</w:t>
-      </w:r>
-    </w:p>
-    <w:p>
-      <w:pPr>
-        <w:spacing w:after="20"/>
-      </w:pPr>
-      <w:r>
-        <w:rPr>
-          <w:rFonts w:ascii="Courier New" w:hAnsi="Courier New"/>
-          <w:sz w:val="16"/>
-        </w:rPr>
-        <w:t>│  PlaceSearch (Лат/Кир поиск)     │ AppState (Глобальный контроллер)     │</w:t>
-      </w:r>
-    </w:p>
-    <w:p>
-      <w:pPr>
-        <w:spacing w:after="20"/>
-      </w:pPr>
-      <w:r>
-        <w:rPr>
-          <w:rFonts w:ascii="Courier New" w:hAnsi="Courier New"/>
-          <w:sz w:val="16"/>
-        </w:rPr>
-        <w:t>└────────────────────────────────────┬────────────────────────────────────┘</w:t>
-      </w:r>
-    </w:p>
-    <w:p>
-      <w:pPr>
-        <w:spacing w:after="20"/>
-      </w:pPr>
-      <w:r>
-        <w:rPr>
-          <w:rFonts w:ascii="Courier New" w:hAnsi="Courier New"/>
-          <w:sz w:val="16"/>
-        </w:rPr>
-        <w:t>│ Внутренние модели и структуры</w:t>
-      </w:r>
-    </w:p>
-    <w:p>
-      <w:pPr>
-        <w:spacing w:after="20"/>
-      </w:pPr>
-      <w:r>
-        <w:rPr>
-          <w:rFonts w:ascii="Courier New" w:hAnsi="Courier New"/>
-          <w:sz w:val="16"/>
-        </w:rPr>
-        <w:t>┌────────────────────────────────────▼────────────────────────────────────┐</w:t>
-      </w:r>
-    </w:p>
-    <w:p>
-      <w:pPr>
-        <w:spacing w:after="20"/>
-      </w:pPr>
-      <w:r>
-        <w:rPr>
-          <w:rFonts w:ascii="Courier New" w:hAnsi="Courier New"/>
-          <w:sz w:val="16"/>
-        </w:rPr>
-        <w:t>│ 3. ЛОКАЛЬНЫЕ ДАННЫЕ И РЕНДЕРИНГ (Data &amp; Local GIS Assets)                │</w:t>
-      </w:r>
-    </w:p>
-    <w:p>
-      <w:pPr>
-        <w:spacing w:after="20"/>
-      </w:pPr>
-      <w:r>
-        <w:rPr>
-          <w:rFonts w:ascii="Courier New" w:hAnsi="Courier New"/>
-          <w:sz w:val="16"/>
-        </w:rPr>
-        <w:t>│  network.json (Граф сети GTFS)   │ MapLibre GL Native (3D Vector Tiles) │</w:t>
-      </w:r>
-    </w:p>
-    <w:p>
-      <w:pPr>
-        <w:spacing w:after="20"/>
-      </w:pPr>
-      <w:r>
-        <w:rPr>
-          <w:rFonts w:ascii="Courier New" w:hAnsi="Courier New"/>
-          <w:sz w:val="16"/>
-        </w:rPr>
-        <w:t>│  OpenFreeMap / OSM Style         │ Inter Fonts (Шрифтовой стек UI)      │</w:t>
-      </w:r>
-    </w:p>
-    <w:p>
-      <w:pPr>
-        <w:spacing w:after="20"/>
-      </w:pPr>
-      <w:r>
-        <w:rPr>
-          <w:rFonts w:ascii="Courier New" w:hAnsi="Courier New"/>
-          <w:sz w:val="16"/>
-        </w:rPr>
-        <w:t>└────────────────────────────────────┬────────────────────────────────────┘</w:t>
-      </w:r>
-    </w:p>
-    <w:p>
-      <w:pPr>
-        <w:spacing w:after="20"/>
-      </w:pPr>
-      <w:r>
-        <w:rPr>
-          <w:rFonts w:ascii="Courier New" w:hAnsi="Courier New"/>
-          <w:sz w:val="16"/>
-        </w:rPr>
-        <w:t>│ Синхронизация при наличии сети</w:t>
-      </w:r>
-    </w:p>
-    <w:p>
-      <w:pPr>
-        <w:spacing w:after="20"/>
-      </w:pPr>
-      <w:r>
-        <w:rPr>
-          <w:rFonts w:ascii="Courier New" w:hAnsi="Courier New"/>
-          <w:sz w:val="16"/>
-        </w:rPr>
-        <w:t>┌────────────────────────────────────▼────────────────────────────────────┐</w:t>
-      </w:r>
-    </w:p>
-    <w:p>
-      <w:pPr>
-        <w:spacing w:after="20"/>
-      </w:pPr>
-      <w:r>
-        <w:rPr>
-          <w:rFonts w:ascii="Courier New" w:hAnsi="Courier New"/>
-          <w:sz w:val="16"/>
-        </w:rPr>
-        <w:t>│ 4. СЕРВЕРНАЯ ЧАСТЬ И B2G АНАЛИТИКА (Cloud API &amp; Transport Analytics)    │</w:t>
-      </w:r>
-    </w:p>
-    <w:p>
-      <w:pPr>
-        <w:spacing w:after="20"/>
-      </w:pPr>
-      <w:r>
-        <w:rPr>
-          <w:rFonts w:ascii="Courier New" w:hAnsi="Courier New"/>
-          <w:sz w:val="16"/>
-        </w:rPr>
-        <w:t>│  Обновления GTFS базы данных     │ B2G Тепловая карта спроса для города │</w:t>
-      </w:r>
-    </w:p>
-    <w:p>
-      <w:pPr>
-        <w:spacing w:after="20"/>
-      </w:pPr>
-      <w:r>
-        <w:rPr>
-          <w:rFonts w:ascii="Courier New" w:hAnsi="Courier New"/>
-          <w:sz w:val="16"/>
-        </w:rPr>
-        <w:t>│  Nominatim Geocoding Fallback    │ Телематика GPS автопарков (2-й этап) │</w:t>
-      </w:r>
-    </w:p>
-    <w:p>
-      <w:pPr>
-        <w:spacing w:after="20"/>
-      </w:pPr>
-      <w:r>
-        <w:rPr>
-          <w:rFonts w:ascii="Courier New" w:hAnsi="Courier New"/>
-          <w:sz w:val="16"/>
-        </w:rPr>
-        <w:t>└─────────────────────────────────────────────────────────────────────────┘</w:t>
       </w:r>
     </w:p>
     <w:p>
@@ -1504,7 +1268,7 @@
     </w:p>
     <w:p>
       <w:pPr>
-        <w:spacing w:before="280" w:after="80"/>
+        <w:spacing w:before="280" w:after="120"/>
       </w:pPr>
       <w:r>
         <w:rPr>
@@ -1513,6 +1277,46 @@
           <w:sz w:val="26"/>
         </w:rPr>
         <w:t>4. Как работает алгоритм маршрутизации RAPTOR</w:t>
+      </w:r>
+    </w:p>
+    <w:p>
+      <w:pPr>
+        <w:spacing w:after="200"/>
+        <w:jc w:val="center"/>
+      </w:pPr>
+      <w:r>
+        <w:drawing>
+          <wp:inline xmlns:a="http://schemas.openxmlformats.org/drawingml/2006/main" xmlns:pic="http://schemas.openxmlformats.org/drawingml/2006/picture">
+            <wp:extent cx="5852160" cy="1755648"/>
+            <wp:docPr id="2" name="Picture 2"/>
+            <wp:cNvGraphicFramePr>
+              <a:graphicFrameLocks noChangeAspect="1"/>
+            </wp:cNvGraphicFramePr>
+            <a:graphic>
+              <a:graphicData uri="http://schemas.openxmlformats.org/drawingml/2006/picture">
+                <pic:pic>
+                  <pic:nvPicPr>
+                    <pic:cNvPr id="0" name="raptor_flow_diagram.png"/>
+                    <pic:cNvPicPr/>
+                  </pic:nvPicPr>
+                  <pic:blipFill>
+                    <a:blip r:embed="rId10"/>
+                    <a:stretch>
+                      <a:fillRect/>
+                    </a:stretch>
+                  </pic:blipFill>
+                  <pic:spPr>
+                    <a:xfrm>
+                      <a:off x="0" y="0"/>
+                      <a:ext cx="5852160" cy="1755648"/>
+                    </a:xfrm>
+                    <a:prstGeom prst="rect"/>
+                  </pic:spPr>
+                </pic:pic>
+              </a:graphicData>
+            </a:graphic>
+          </wp:inline>
+        </w:drawing>
       </w:r>
     </w:p>
     <w:p>
@@ -1541,30 +1345,6 @@
     </w:p>
     <w:p>
       <w:pPr>
-        <w:spacing w:after="20"/>
-      </w:pPr>
-      <w:r>
-        <w:rPr>
-          <w:rFonts w:ascii="Courier New" w:hAnsi="Courier New"/>
-          <w:sz w:val="16"/>
-        </w:rPr>
-        <w:t>│</w:t>
-      </w:r>
-    </w:p>
-    <w:p>
-      <w:pPr>
-        <w:spacing w:after="80"/>
-      </w:pPr>
-      <w:r>
-        <w:rPr>
-          <w:color w:val="15171C"/>
-          <w:sz w:val="20"/>
-        </w:rPr>
-        <w:t>▼</w:t>
-      </w:r>
-    </w:p>
-    <w:p>
-      <w:pPr>
         <w:spacing w:after="80"/>
       </w:pPr>
       <w:r>
@@ -1573,30 +1353,6 @@
           <w:sz w:val="20"/>
         </w:rPr>
         <w:t>[Раунд 1: Прямые маршруты без пересадок]</w:t>
-      </w:r>
-    </w:p>
-    <w:p>
-      <w:pPr>
-        <w:spacing w:after="20"/>
-      </w:pPr>
-      <w:r>
-        <w:rPr>
-          <w:rFonts w:ascii="Courier New" w:hAnsi="Courier New"/>
-          <w:sz w:val="16"/>
-        </w:rPr>
-        <w:t>│  (Найдено? Проверяем время прибытия)</w:t>
-      </w:r>
-    </w:p>
-    <w:p>
-      <w:pPr>
-        <w:spacing w:after="80"/>
-      </w:pPr>
-      <w:r>
-        <w:rPr>
-          <w:color w:val="15171C"/>
-          <w:sz w:val="20"/>
-        </w:rPr>
-        <w:t>▼</w:t>
       </w:r>
     </w:p>
     <w:p>
@@ -1613,30 +1369,6 @@
     </w:p>
     <w:p>
       <w:pPr>
-        <w:spacing w:after="20"/>
-      </w:pPr>
-      <w:r>
-        <w:rPr>
-          <w:rFonts w:ascii="Courier New" w:hAnsi="Courier New"/>
-          <w:sz w:val="16"/>
-        </w:rPr>
-        <w:t>│  (Смена маршрута в общем узле сети)</w:t>
-      </w:r>
-    </w:p>
-    <w:p>
-      <w:pPr>
-        <w:spacing w:after="80"/>
-      </w:pPr>
-      <w:r>
-        <w:rPr>
-          <w:color w:val="15171C"/>
-          <w:sz w:val="20"/>
-        </w:rPr>
-        <w:t>▼</w:t>
-      </w:r>
-    </w:p>
-    <w:p>
-      <w:pPr>
         <w:spacing w:after="80"/>
       </w:pPr>
       <w:r>
@@ -1645,30 +1377,6 @@
           <w:sz w:val="20"/>
         </w:rPr>
         <w:t>[Раунд 3: Маршруты с 2 пересадками]</w:t>
-      </w:r>
-    </w:p>
-    <w:p>
-      <w:pPr>
-        <w:spacing w:after="20"/>
-      </w:pPr>
-      <w:r>
-        <w:rPr>
-          <w:rFonts w:ascii="Courier New" w:hAnsi="Courier New"/>
-          <w:sz w:val="16"/>
-        </w:rPr>
-        <w:t>│</w:t>
-      </w:r>
-    </w:p>
-    <w:p>
-      <w:pPr>
-        <w:spacing w:after="80"/>
-      </w:pPr>
-      <w:r>
-        <w:rPr>
-          <w:color w:val="15171C"/>
-          <w:sz w:val="20"/>
-        </w:rPr>
-        <w:t>▼</w:t>
       </w:r>
     </w:p>
     <w:p>
@@ -1746,7 +1454,7 @@
     </w:p>
     <w:p>
       <w:pPr>
-        <w:spacing w:before="280" w:after="80"/>
+        <w:spacing w:before="280" w:after="120"/>
       </w:pPr>
       <w:r>
         <w:rPr>
@@ -1755,6 +1463,46 @@
           <w:sz w:val="26"/>
         </w:rPr>
         <w:t>5. Интерактивная 3D-карта и Схема в стиле метро</w:t>
+      </w:r>
+    </w:p>
+    <w:p>
+      <w:pPr>
+        <w:spacing w:after="200"/>
+        <w:jc w:val="center"/>
+      </w:pPr>
+      <w:r>
+        <w:drawing>
+          <wp:inline xmlns:a="http://schemas.openxmlformats.org/drawingml/2006/main" xmlns:pic="http://schemas.openxmlformats.org/drawingml/2006/picture">
+            <wp:extent cx="5029200" cy="3436620"/>
+            <wp:docPr id="3" name="Picture 3"/>
+            <wp:cNvGraphicFramePr>
+              <a:graphicFrameLocks noChangeAspect="1"/>
+            </wp:cNvGraphicFramePr>
+            <a:graphic>
+              <a:graphicData uri="http://schemas.openxmlformats.org/drawingml/2006/picture">
+                <pic:pic>
+                  <pic:nvPicPr>
+                    <pic:cNvPr id="0" name="scheme_ru.png"/>
+                    <pic:cNvPicPr/>
+                  </pic:nvPicPr>
+                  <pic:blipFill>
+                    <a:blip r:embed="rId11"/>
+                    <a:stretch>
+                      <a:fillRect/>
+                    </a:stretch>
+                  </pic:blipFill>
+                  <pic:spPr>
+                    <a:xfrm>
+                      <a:off x="0" y="0"/>
+                      <a:ext cx="5029200" cy="3436620"/>
+                    </a:xfrm>
+                    <a:prstGeom prst="rect"/>
+                  </pic:spPr>
+                </pic:pic>
+              </a:graphicData>
+            </a:graphic>
+          </wp:inline>
+        </w:drawing>
       </w:r>
     </w:p>
     <w:p>
@@ -1881,7 +1629,7 @@
     </w:p>
     <w:p>
       <w:pPr>
-        <w:spacing w:before="280" w:after="80"/>
+        <w:spacing w:before="280" w:after="120"/>
       </w:pPr>
       <w:r>
         <w:rPr>
@@ -2016,7 +1764,7 @@
     </w:p>
     <w:p>
       <w:pPr>
-        <w:spacing w:before="280" w:after="80"/>
+        <w:spacing w:before="280" w:after="120"/>
       </w:pPr>
       <w:r>
         <w:rPr>
@@ -2517,7 +2265,7 @@
     </w:p>
     <w:p>
       <w:pPr>
-        <w:spacing w:before="280" w:after="80"/>
+        <w:spacing w:before="280" w:after="120"/>
       </w:pPr>
       <w:r>
         <w:rPr>
@@ -2554,426 +2302,6 @@
     </w:p>
     <w:p>
       <w:pPr>
-        <w:spacing w:after="20"/>
-      </w:pPr>
-      <w:r>
-        <w:rPr>
-          <w:rFonts w:ascii="Courier New" w:hAnsi="Courier New"/>
-          <w:sz w:val="16"/>
-        </w:rPr>
-        <w:t>├── assets/</w:t>
-      </w:r>
-    </w:p>
-    <w:p>
-      <w:pPr>
-        <w:spacing w:after="20"/>
-      </w:pPr>
-      <w:r>
-        <w:rPr>
-          <w:rFonts w:ascii="Courier New" w:hAnsi="Courier New"/>
-          <w:sz w:val="16"/>
-        </w:rPr>
-        <w:t>│   ├── data/</w:t>
-      </w:r>
-    </w:p>
-    <w:p>
-      <w:pPr>
-        <w:spacing w:after="20"/>
-      </w:pPr>
-      <w:r>
-        <w:rPr>
-          <w:rFonts w:ascii="Courier New" w:hAnsi="Courier New"/>
-          <w:sz w:val="16"/>
-        </w:rPr>
-        <w:t>│   │   └── network.json         # Вся оцифрованная база сети (маршруты, координаты, интервалы)</w:t>
-      </w:r>
-    </w:p>
-    <w:p>
-      <w:pPr>
-        <w:spacing w:after="20"/>
-      </w:pPr>
-      <w:r>
-        <w:rPr>
-          <w:rFonts w:ascii="Courier New" w:hAnsi="Courier New"/>
-          <w:sz w:val="16"/>
-        </w:rPr>
-        <w:t>│   └── fonts/</w:t>
-      </w:r>
-    </w:p>
-    <w:p>
-      <w:pPr>
-        <w:spacing w:after="20"/>
-      </w:pPr>
-      <w:r>
-        <w:rPr>
-          <w:rFonts w:ascii="Courier New" w:hAnsi="Courier New"/>
-          <w:sz w:val="16"/>
-        </w:rPr>
-        <w:t>│       └── Inter-*.ttf          # Полный комплект шрифтов Inter (Medium, Bold, Black)</w:t>
-      </w:r>
-    </w:p>
-    <w:p>
-      <w:pPr>
-        <w:spacing w:after="20"/>
-      </w:pPr>
-      <w:r>
-        <w:rPr>
-          <w:rFonts w:ascii="Courier New" w:hAnsi="Courier New"/>
-          <w:sz w:val="16"/>
-        </w:rPr>
-        <w:t>├── lib/</w:t>
-      </w:r>
-    </w:p>
-    <w:p>
-      <w:pPr>
-        <w:spacing w:after="20"/>
-      </w:pPr>
-      <w:r>
-        <w:rPr>
-          <w:rFonts w:ascii="Courier New" w:hAnsi="Courier New"/>
-          <w:sz w:val="16"/>
-        </w:rPr>
-        <w:t>│   ├── core/</w:t>
-      </w:r>
-    </w:p>
-    <w:p>
-      <w:pPr>
-        <w:spacing w:after="20"/>
-      </w:pPr>
-      <w:r>
-        <w:rPr>
-          <w:rFonts w:ascii="Courier New" w:hAnsi="Courier New"/>
-          <w:sz w:val="16"/>
-        </w:rPr>
-        <w:t>│   │   ├── app_state.dart       # Главный реактивный контроллер состояния (ChangeNotifier)</w:t>
-      </w:r>
-    </w:p>
-    <w:p>
-      <w:pPr>
-        <w:spacing w:after="20"/>
-      </w:pPr>
-      <w:r>
-        <w:rPr>
-          <w:rFonts w:ascii="Courier New" w:hAnsi="Courier New"/>
-          <w:sz w:val="16"/>
-        </w:rPr>
-        <w:t>│   │   ├── i18n.dart            # Полный словарь локализации (O‘zbek, Русский, English)</w:t>
-      </w:r>
-    </w:p>
-    <w:p>
-      <w:pPr>
-        <w:spacing w:after="20"/>
-      </w:pPr>
-      <w:r>
-        <w:rPr>
-          <w:rFonts w:ascii="Courier New" w:hAnsi="Courier New"/>
-          <w:sz w:val="16"/>
-        </w:rPr>
-        <w:t>│   │   └── theme.dart           # Дизайн-токены (цвета линий, тени, скругления, типографика)</w:t>
-      </w:r>
-    </w:p>
-    <w:p>
-      <w:pPr>
-        <w:spacing w:after="20"/>
-      </w:pPr>
-      <w:r>
-        <w:rPr>
-          <w:rFonts w:ascii="Courier New" w:hAnsi="Courier New"/>
-          <w:sz w:val="16"/>
-        </w:rPr>
-        <w:t>│   ├── data/</w:t>
-      </w:r>
-    </w:p>
-    <w:p>
-      <w:pPr>
-        <w:spacing w:after="20"/>
-      </w:pPr>
-      <w:r>
-        <w:rPr>
-          <w:rFonts w:ascii="Courier New" w:hAnsi="Courier New"/>
-          <w:sz w:val="16"/>
-        </w:rPr>
-        <w:t>│   │   ├── network.dart         # Модели данных GTFS (Network, BusRoute, Stop, Geo)</w:t>
-      </w:r>
-    </w:p>
-    <w:p>
-      <w:pPr>
-        <w:spacing w:after="20"/>
-      </w:pPr>
-      <w:r>
-        <w:rPr>
-          <w:rFonts w:ascii="Courier New" w:hAnsi="Courier New"/>
-          <w:sz w:val="16"/>
-        </w:rPr>
-        <w:t>│   │   ├── planner.dart         # Алгоритм маршрутизации RAPTOR (Journey, WalkLeg, RideLeg)</w:t>
-      </w:r>
-    </w:p>
-    <w:p>
-      <w:pPr>
-        <w:spacing w:after="20"/>
-      </w:pPr>
-      <w:r>
-        <w:rPr>
-          <w:rFonts w:ascii="Courier New" w:hAnsi="Courier New"/>
-          <w:sz w:val="16"/>
-        </w:rPr>
-        <w:t>│   │   ├── schedule.dart        # Расписания, расчет интервалов и симуляция движения автобусов</w:t>
-      </w:r>
-    </w:p>
-    <w:p>
-      <w:pPr>
-        <w:spacing w:after="20"/>
-      </w:pPr>
-      <w:r>
-        <w:rPr>
-          <w:rFonts w:ascii="Courier New" w:hAnsi="Courier New"/>
-          <w:sz w:val="16"/>
-        </w:rPr>
-        <w:t>│   │   └── search.dart          # Поисковый индекс с транслитерацией латиницы и кириллицы</w:t>
-      </w:r>
-    </w:p>
-    <w:p>
-      <w:pPr>
-        <w:spacing w:after="20"/>
-      </w:pPr>
-      <w:r>
-        <w:rPr>
-          <w:rFonts w:ascii="Courier New" w:hAnsi="Courier New"/>
-          <w:sz w:val="16"/>
-        </w:rPr>
-        <w:t>│   ├── ui/</w:t>
-      </w:r>
-    </w:p>
-    <w:p>
-      <w:pPr>
-        <w:spacing w:after="20"/>
-      </w:pPr>
-      <w:r>
-        <w:rPr>
-          <w:rFonts w:ascii="Courier New" w:hAnsi="Courier New"/>
-          <w:sz w:val="16"/>
-        </w:rPr>
-        <w:t>│   │   ├── home_screen.dart     # Главный экран с картой и интерактивными карточками</w:t>
-      </w:r>
-    </w:p>
-    <w:p>
-      <w:pPr>
-        <w:spacing w:after="20"/>
-      </w:pPr>
-      <w:r>
-        <w:rPr>
-          <w:rFonts w:ascii="Courier New" w:hAnsi="Courier New"/>
-          <w:sz w:val="16"/>
-        </w:rPr>
-        <w:t>│   │   ├── map_view.dart        # Обертка MapLibre GL с отрисовкой 3D-зданий и трасс</w:t>
-      </w:r>
-    </w:p>
-    <w:p>
-      <w:pPr>
-        <w:spacing w:after="20"/>
-      </w:pPr>
-      <w:r>
-        <w:rPr>
-          <w:rFonts w:ascii="Courier New" w:hAnsi="Courier New"/>
-          <w:sz w:val="16"/>
-        </w:rPr>
-        <w:t>│   │   ├── map_style.dart       # Векторный стиль карты города (OpenFreeMap vector tile style)</w:t>
-      </w:r>
-    </w:p>
-    <w:p>
-      <w:pPr>
-        <w:spacing w:after="20"/>
-      </w:pPr>
-      <w:r>
-        <w:rPr>
-          <w:rFonts w:ascii="Courier New" w:hAnsi="Courier New"/>
-          <w:sz w:val="16"/>
-        </w:rPr>
-        <w:t>│   │   ├── scheme_screen.dart   # Октолинейный векторный холст схемы в стиле метро</w:t>
-      </w:r>
-    </w:p>
-    <w:p>
-      <w:pPr>
-        <w:spacing w:after="20"/>
-      </w:pPr>
-      <w:r>
-        <w:rPr>
-          <w:rFonts w:ascii="Courier New" w:hAnsi="Courier New"/>
-          <w:sz w:val="16"/>
-        </w:rPr>
-        <w:t>│   │   ├── search_screen.dart   # Экран поиска и детального сравнения вариантов пути</w:t>
-      </w:r>
-    </w:p>
-    <w:p>
-      <w:pPr>
-        <w:spacing w:after="20"/>
-      </w:pPr>
-      <w:r>
-        <w:rPr>
-          <w:rFonts w:ascii="Courier New" w:hAnsi="Courier New"/>
-          <w:sz w:val="16"/>
-        </w:rPr>
-        <w:t>│   │   ├── trip_progress.dart   # Виджет ведения пассажира по остановкам во время поездки</w:t>
-      </w:r>
-    </w:p>
-    <w:p>
-      <w:pPr>
-        <w:spacing w:after="20"/>
-      </w:pPr>
-      <w:r>
-        <w:rPr>
-          <w:rFonts w:ascii="Courier New" w:hAnsi="Courier New"/>
-          <w:sz w:val="16"/>
-        </w:rPr>
-        <w:t>│   │   ├── settings_sheet.dart  # Настройки языка, крупного текста и демонстрационного таймера</w:t>
-      </w:r>
-    </w:p>
-    <w:p>
-      <w:pPr>
-        <w:spacing w:after="20"/>
-      </w:pPr>
-      <w:r>
-        <w:rPr>
-          <w:rFonts w:ascii="Courier New" w:hAnsi="Courier New"/>
-          <w:sz w:val="16"/>
-        </w:rPr>
-        <w:t>│   │   └── widgets.dart         # Переиспользуемые бейджи маршрутов, карточки и кнопки</w:t>
-      </w:r>
-    </w:p>
-    <w:p>
-      <w:pPr>
-        <w:spacing w:after="20"/>
-      </w:pPr>
-      <w:r>
-        <w:rPr>
-          <w:rFonts w:ascii="Courier New" w:hAnsi="Courier New"/>
-          <w:sz w:val="16"/>
-        </w:rPr>
-        <w:t>│   └── main.dart                # Точка входа в приложение, инициализация зависимостей</w:t>
-      </w:r>
-    </w:p>
-    <w:p>
-      <w:pPr>
-        <w:spacing w:after="20"/>
-      </w:pPr>
-      <w:r>
-        <w:rPr>
-          <w:rFonts w:ascii="Courier New" w:hAnsi="Courier New"/>
-          <w:sz w:val="16"/>
-        </w:rPr>
-        <w:t>├── test/</w:t>
-      </w:r>
-    </w:p>
-    <w:p>
-      <w:pPr>
-        <w:spacing w:after="20"/>
-      </w:pPr>
-      <w:r>
-        <w:rPr>
-          <w:rFonts w:ascii="Courier New" w:hAnsi="Courier New"/>
-          <w:sz w:val="16"/>
-        </w:rPr>
-        <w:t>│   └── planner_test.dart        # Автотесты: прямые пути, пересадки, RAPTOR, расписания (7 из 7)</w:t>
-      </w:r>
-    </w:p>
-    <w:p>
-      <w:pPr>
-        <w:spacing w:after="20"/>
-      </w:pPr>
-      <w:r>
-        <w:rPr>
-          <w:rFonts w:ascii="Courier New" w:hAnsi="Courier New"/>
-          <w:sz w:val="16"/>
-        </w:rPr>
-        <w:t>├── tool/</w:t>
-      </w:r>
-    </w:p>
-    <w:p>
-      <w:pPr>
-        <w:spacing w:after="20"/>
-      </w:pPr>
-      <w:r>
-        <w:rPr>
-          <w:rFonts w:ascii="Courier New" w:hAnsi="Courier New"/>
-          <w:sz w:val="16"/>
-        </w:rPr>
-        <w:t>│   ├── generate_qr.py           # Генератор брендированных QR-кодов и промо-постеров</w:t>
-      </w:r>
-    </w:p>
-    <w:p>
-      <w:pPr>
-        <w:spacing w:after="20"/>
-      </w:pPr>
-      <w:r>
-        <w:rPr>
-          <w:rFonts w:ascii="Courier New" w:hAnsi="Courier New"/>
-          <w:sz w:val="16"/>
-        </w:rPr>
-        <w:t>│   └── shoot.py                 # Утилита автоматического снятия скриншотов</w:t>
-      </w:r>
-    </w:p>
-    <w:p>
-      <w:pPr>
-        <w:spacing w:after="20"/>
-      </w:pPr>
-      <w:r>
-        <w:rPr>
-          <w:rFonts w:ascii="Courier New" w:hAnsi="Courier New"/>
-          <w:sz w:val="16"/>
-        </w:rPr>
-        <w:t>└── docs/</w:t>
-      </w:r>
-    </w:p>
-    <w:p>
-      <w:pPr>
-        <w:spacing w:after="20"/>
-      </w:pPr>
-      <w:r>
-        <w:rPr>
-          <w:rFonts w:ascii="Courier New" w:hAnsi="Courier New"/>
-          <w:sz w:val="16"/>
-        </w:rPr>
-        <w:t>├── BEKAT_ARCHITECTURE.md    # Данное техническое руководство</w:t>
-      </w:r>
-    </w:p>
-    <w:p>
-      <w:pPr>
-        <w:spacing w:after="20"/>
-      </w:pPr>
-      <w:r>
-        <w:rPr>
-          <w:rFonts w:ascii="Courier New" w:hAnsi="Courier New"/>
-          <w:sz w:val="16"/>
-        </w:rPr>
-        <w:t>├── Bekat_Prezentatsiya_RU.pptx # Презентация проекта (RU)</w:t>
-      </w:r>
-    </w:p>
-    <w:p>
-      <w:pPr>
-        <w:spacing w:after="20"/>
-      </w:pPr>
-      <w:r>
-        <w:rPr>
-          <w:rFonts w:ascii="Courier New" w:hAnsi="Courier New"/>
-          <w:sz w:val="16"/>
-        </w:rPr>
-        <w:t>├── Bekat_Taqdimot_UZ.pptx   # Презентация проекта (UZ)</w:t>
-      </w:r>
-    </w:p>
-    <w:p>
-      <w:pPr>
-        <w:spacing w:after="20"/>
-      </w:pPr>
-      <w:r>
-        <w:rPr>
-          <w:rFonts w:ascii="Courier New" w:hAnsi="Courier New"/>
-          <w:sz w:val="16"/>
-        </w:rPr>
-        <w:t>└── Eng_yaxshi_kreativ_goya_Bekat_Qodirov_Ulugbek.docx # Официальный документ на конкурс</w:t>
-      </w:r>
-    </w:p>
-    <w:p>
-      <w:pPr>
         <w:spacing w:after="80"/>
       </w:pPr>
       <w:r>
@@ -2986,7 +2314,7 @@
     </w:p>
     <w:p>
       <w:pPr>
-        <w:spacing w:before="280" w:after="80"/>
+        <w:spacing w:before="280" w:after="120"/>
       </w:pPr>
       <w:r>
         <w:rPr>

</xml_diff>